<commit_message>
feat(riesame): G3 input 9.3.2 c.5 monitoraggio e misurazione (+G6 fix filtro azienda)
- Migration 112 (vps+local, idempotente): aggiunge colonna input_monitoring
  NVARCHAR(MAX) NULL a management_reviews. Applicata al DB di produzione.
- Controller createReview/updateReview e generate-outputs: persiste e usa
  input_monitoring (9.3.2 c.5 Risultati di monitoraggio e misurazione).
- Export Word + generatore template: nuovo segnaposto {input_monitoring}.
- G6: la query obiettivi in generateDraft/generateOutputs ora filtra per
  company_id, allineata a getInputSummary (prima ignorava l'azienda).

Co-authored-by: Cursor <cursoragent@cursor.com>
</commit_message>
<xml_diff>
--- a/app/public/templates/management-review-verbale.docx
+++ b/app/public/templates/management-review-verbale.docx
@@ -1236,6 +1236,117 @@
                 <w:rFonts w:ascii="Arial" w:cs="Arial" w:eastAsia="Arial" w:hAnsi="Arial"/>
               </w:rPr>
               <w:t xml:space="preserve">{input_process_performance}</w:t>
+            </w:r>
+          </w:p>
+        </w:tc>
+      </w:tr>
+    </w:tbl>
+    <w:p>
+      <w:pPr>
+        <w:spacing w:before="0" w:after="120"/>
+        <w:jc w:val="left"/>
+      </w:pPr>
+      <w:r>
+        <w:rPr>
+          <w:b w:val="false"/>
+          <w:bCs w:val="false"/>
+          <w:color w:val="000000"/>
+          <w:sz w:val="20"/>
+          <w:szCs w:val="20"/>
+          <w:rFonts w:ascii="Arial" w:cs="Arial" w:eastAsia="Arial" w:hAnsi="Arial"/>
+        </w:rPr>
+      </w:r>
+    </w:p>
+    <w:tbl>
+      <w:tblPr>
+        <w:tblW w:type="pct" w:w="100%"/>
+        <w:tblBorders>
+          <w:top w:val="single" w:color="CBD5E0" w:sz="4"/>
+          <w:left w:val="single" w:color="CBD5E0" w:sz="4"/>
+          <w:bottom w:val="single" w:color="CBD5E0" w:sz="4"/>
+          <w:right w:val="single" w:color="CBD5E0" w:sz="4"/>
+          <w:insideH w:val="single" w:color="auto" w:sz="4"/>
+          <w:insideV w:val="single" w:color="auto" w:sz="4"/>
+        </w:tblBorders>
+        <w:tblCellMar>
+          <w:top w:type="dxa" w:w="0"/>
+          <w:left w:type="dxa" w:w="0"/>
+          <w:bottom w:type="dxa" w:w="0"/>
+          <w:right w:type="dxa" w:w="0"/>
+        </w:tblCellMar>
+      </w:tblPr>
+      <w:tblGrid>
+        <w:gridCol w:w="100"/>
+      </w:tblGrid>
+      <w:tr>
+        <w:tc>
+          <w:tcPr>
+            <w:tcBorders>
+              <w:top w:val="single" w:color="CBD5E0" w:sz="4"/>
+              <w:left w:val="single" w:color="CBD5E0" w:sz="4"/>
+              <w:bottom w:val="single" w:color="CBD5E0" w:sz="4"/>
+              <w:right w:val="single" w:color="CBD5E0" w:sz="4"/>
+            </w:tcBorders>
+            <w:shd w:fill="F7FAFC" w:val="solid"/>
+            <w:tcMar>
+              <w:top w:type="dxa" w:w="80"/>
+              <w:left w:type="dxa" w:w="100"/>
+              <w:bottom w:type="dxa" w:w="80"/>
+              <w:right w:type="dxa" w:w="100"/>
+            </w:tcMar>
+            <w:vAlign w:val="center"/>
+          </w:tcPr>
+          <w:p>
+            <w:pPr>
+              <w:spacing w:before="0" w:after="120"/>
+              <w:jc w:val="left"/>
+            </w:pPr>
+            <w:r>
+              <w:rPr>
+                <w:b/>
+                <w:bCs/>
+                <w:color w:val="1A365D"/>
+                <w:sz w:val="18"/>
+                <w:szCs w:val="18"/>
+                <w:rFonts w:ascii="Arial" w:cs="Arial" w:eastAsia="Arial" w:hAnsi="Arial"/>
+              </w:rPr>
+              <w:t xml:space="preserve">c.5) Risultati del monitoraggio e della misurazione  [§9.3.2 c.5]</w:t>
+            </w:r>
+          </w:p>
+        </w:tc>
+      </w:tr>
+      <w:tr>
+        <w:tc>
+          <w:tcPr>
+            <w:tcBorders>
+              <w:top w:val="single" w:color="CBD5E0" w:sz="4"/>
+              <w:left w:val="single" w:color="CBD5E0" w:sz="4"/>
+              <w:bottom w:val="single" w:color="CBD5E0" w:sz="4"/>
+              <w:right w:val="single" w:color="CBD5E0" w:sz="4"/>
+            </w:tcBorders>
+            <w:tcMar>
+              <w:top w:type="dxa" w:w="80"/>
+              <w:left w:type="dxa" w:w="100"/>
+              <w:bottom w:type="dxa" w:w="80"/>
+              <w:right w:type="dxa" w:w="100"/>
+            </w:tcMar>
+            <w:vAlign w:val="center"/>
+          </w:tcPr>
+          <w:p>
+            <w:pPr>
+              <w:spacing w:before="0" w:after="120"/>
+              <w:jc w:val="left"/>
+            </w:pPr>
+            <w:r>
+              <w:rPr>
+                <w:b w:val="false"/>
+                <w:bCs w:val="false"/>
+                <w:color w:val="718096"/>
+                <w:sz w:val="20"/>
+                <w:szCs w:val="20"/>
+                <w:rFonts w:ascii="Arial" w:cs="Arial" w:eastAsia="Arial" w:hAnsi="Arial"/>
+              </w:rPr>
+              <w:t xml:space="preserve">{input_monitoring}</w:t>
             </w:r>
           </w:p>
         </w:tc>

</xml_diff>